<commit_message>
Update SOP-06 for Ethidium Bromide
</commit_message>
<xml_diff>
--- a/lab_safety_docs/standard-operating-procedures/SOP-06_Ethidium-Bromide.docx
+++ b/lab_safety_docs/standard-operating-procedures/SOP-06_Ethidium-Bromide.docx
@@ -48,7 +48,7 @@
           <w:sz w:val="18"/>
           <w:szCs w:val="18"/>
         </w:rPr>
-        <w:t xml:space="preserve">Roberts Lab, School of Aquatic and Fishery Sciences  -  Rev. 0 - September 1, 2026</w:t>
+        <w:t>Roberts Lab, School of Aquatic and Fishery Sciences  -  Rev. 1 - September 11, 2026</w:t>
       </w:r>
     </w:p>
     <w:tbl>
@@ -750,7 +750,7 @@
                 <w:sz w:val="20"/>
                 <w:szCs w:val="20"/>
               </w:rPr>
-              <w:t xml:space="preserve">Ethidium bromide working solutions (10 mg/mL stock; 0.5 microgram/mL in agarose gels and running buffer)</w:t>
+              <w:t>Ethidium bromide working solutions (10 mg/mL stock; 0.1 microgram/mL final in stained agarose gels only - not added to running buffer)</w:t>
             </w:r>
           </w:p>
         </w:tc>
@@ -872,7 +872,7 @@
           <w:sz w:val="20"/>
           <w:szCs w:val="20"/>
         </w:rPr>
-        <w:t xml:space="preserve">Stock chemicals: 1 g of ethidium bromide POWDER. Intermediates and working solutions: 10 mg/mL aqueous stock; agarose gels and 1X TAE/TBE running buffer containing 0.5 microgram/mL; stained gels. Wastes: stained gels, contaminated running buffer, contaminated gloves, tips and wipes, and any unused powder.</w:t>
+        <w:t>Stock chemicals: 1 g of ethidium bromide POWDER. Intermediates and working solutions: 10 mg/mL aqueous stock, added directly to molten agarose to cast stained gels at 0.1 microgram/mL final (1 uL of 10 mg/mL stock per 100 mL of gel volume). Ethidium bromide is NOT added to the 1X TAE/TBE electrophoresis (running) buffer - only the gel itself is stained. Wastes: stained gels, contaminated gloves, tips and wipes, and any unused powder.</w:t>
       </w:r>
     </w:p>
     <w:p>
@@ -1552,7 +1552,7 @@
           <w:sz w:val="20"/>
           <w:szCs w:val="20"/>
         </w:rPr>
-        <w:t xml:space="preserve">Ethidium bromide POWDER is never permitted to be handled outside of the chemical fume hood. Aqueous solutions at 0.5 microgram/mL (gels and running buffer) and the 10 mg/mL stock, once made, may be used at the designated gel bench outside the fume hood.</w:t>
+        <w:t>Ethidium bromide POWDER is never permitted to be handled outside of the chemical fume hood. The stained gel (0.1 microgram/mL) and the 10 mg/mL stock, once made, may be used at the designated gel bench outside the fume hood. The electrophoresis running buffer is not stained under this SOP.</w:t>
       </w:r>
     </w:p>
     <w:p>
@@ -1644,7 +1644,7 @@
           <w:sz w:val="20"/>
           <w:szCs w:val="20"/>
         </w:rPr>
-        <w:t xml:space="preserve">Quantity limits: no more than 100 mg of powder is weighed in a single operation, and only enough 10 mg/mL stock is prepared for approximately one year of use. Working gel and buffer concentration is 0.5 microgram/mL.</w:t>
+        <w:t>Quantity limits: no more than 100 mg of powder is weighed in a single operation, and only enough 10 mg/mL stock is prepared for approximately one year of use. Working gel concentration is 0.1 microgram/mL (1 uL of 10 mg/mL stock per 100 mL of gel volume). Ethidium bromide is added only to the molten agarose, never to the electrophoresis running buffer.</w:t>
       </w:r>
     </w:p>
     <w:p>
@@ -1680,7 +1680,7 @@
           <w:sz w:val="20"/>
           <w:szCs w:val="20"/>
         </w:rPr>
-        <w:t xml:space="preserve">All containers - powder bottle, stock tube, gel buffer bottle, waste containers - must be labeled with the full chemical name, concentration, the words 'MUTAGEN - PARTICULARLY HAZARDOUS SUBSTANCE', the date and the preparer's initials.</w:t>
+        <w:t>All containers - powder bottle, stock tube, waste containers - must be labeled with the full chemical name, concentration, the words 'MUTAGEN - PARTICULARLY HAZARDOUS SUBSTANCE', the date and the preparer's initials. The electrophoresis running buffer is not stained under this SOP and does not require this labeling unless it becomes visibly contaminated (see Section 6).</w:t>
       </w:r>
     </w:p>
     <w:p>
@@ -1951,7 +1951,7 @@
           <w:sz w:val="20"/>
           <w:szCs w:val="20"/>
         </w:rPr>
-        <w:t xml:space="preserve">LIQUID spill - less than 100 mL of 0.5 microgram/mL gel buffer at the designated bench: may be handled by trained lab staff wearing safety glasses, double nitrile gloves and a lab coat. Absorb with paper towels or absorbent pads, working from the outside inward, place in the dedicated solid waste container, then wash the area with detergent solution and re-survey with a UV lamp until no fluorescence remains.</w:t>
+        <w:t>LIQUID spill - less than 100 mL of molten stained agarose (0.1 microgram/mL) during casting at the designated bench: may be handled by trained lab staff wearing safety glasses, double nitrile gloves and a lab coat. Absorb with paper towels or absorbent pads, working from the outside inward, place in the dedicated solid waste container, then wash the area with detergent solution and re-survey with a UV lamp until no fluorescence remains.</w:t>
       </w:r>
     </w:p>
     <w:p>
@@ -2330,97 +2330,105 @@
           <w:sz w:val="20"/>
           <w:szCs w:val="20"/>
         </w:rPr>
-        <w:t xml:space="preserve">Waste streams: (a) unused ethidium bromide powder; (b) 10 mg/mL stock solution; (c) stained agarose gels; (d) contaminated running buffer at 0.5 microgram/mL; (e) contaminated solid debris (gloves, tips, wipes, absorbent liners, weigh boats).</w:t>
-      </w:r>
-    </w:p>
-    <w:p>
-      <w:pPr>
-        <w:pStyle w:val="ListParagraph"/>
-        <w:numPr>
-          <w:ilvl w:val="0"/>
-          <w:numId w:val="2"/>
-        </w:numPr>
-        <w:spacing w:after="100" w:line="260"/>
-      </w:pPr>
-      <w:r>
-        <w:rPr>
-          <w:rFonts w:ascii="Calibri" w:cs="Calibri" w:eastAsia="Calibri" w:hAnsi="Calibri"/>
-          <w:sz w:val="20"/>
-          <w:szCs w:val="20"/>
-        </w:rPr>
-        <w:t xml:space="preserve">ALL of these are hazardous waste and are collected by EH&amp;S. Do NOT pour ethidium bromide solutions of any concentration down the drain, and do NOT put stained gels or contaminated debris in the regular trash.</w:t>
-      </w:r>
-    </w:p>
-    <w:p>
-      <w:pPr>
-        <w:pStyle w:val="ListParagraph"/>
-        <w:numPr>
-          <w:ilvl w:val="0"/>
-          <w:numId w:val="2"/>
-        </w:numPr>
-        <w:spacing w:after="100" w:line="260"/>
-      </w:pPr>
-      <w:r>
-        <w:rPr>
-          <w:rFonts w:ascii="Calibri" w:cs="Calibri" w:eastAsia="Calibri" w:hAnsi="Calibri"/>
-          <w:sz w:val="20"/>
-          <w:szCs w:val="20"/>
-        </w:rPr>
-        <w:t xml:space="preserve">Do NOT chemically treat, bleach, or photodegrade ethidium bromide waste in the lab. Hypochlorite treatment produces mutagenic degradation products, and in-lab treatment is not authorized under this SOP.</w:t>
-      </w:r>
-    </w:p>
-    <w:p>
-      <w:pPr>
-        <w:pStyle w:val="ListParagraph"/>
-        <w:numPr>
-          <w:ilvl w:val="0"/>
-          <w:numId w:val="2"/>
-        </w:numPr>
-        <w:spacing w:after="100" w:line="260"/>
-      </w:pPr>
-      <w:r>
-        <w:rPr>
-          <w:rFonts w:ascii="Calibri" w:cs="Calibri" w:eastAsia="Calibri" w:hAnsi="Calibri"/>
-          <w:sz w:val="20"/>
-          <w:szCs w:val="20"/>
-        </w:rPr>
-        <w:t xml:space="preserve">Charcoal filtration of dilute running buffer (e.g., commercial destaining bags or columns) may be used ONLY with prior written EH&amp;S approval; if approved, the loaded charcoal is itself collected as ethidium bromide hazardous waste. Absent that approval, buffer is collected as liquid hazardous waste.</w:t>
-      </w:r>
-    </w:p>
-    <w:p>
-      <w:pPr>
-        <w:pStyle w:val="ListParagraph"/>
-        <w:numPr>
-          <w:ilvl w:val="0"/>
-          <w:numId w:val="2"/>
-        </w:numPr>
-        <w:spacing w:after="100" w:line="260"/>
-      </w:pPr>
-      <w:r>
-        <w:rPr>
-          <w:rFonts w:ascii="Calibri" w:cs="Calibri" w:eastAsia="Calibri" w:hAnsi="Calibri"/>
-          <w:sz w:val="20"/>
-          <w:szCs w:val="20"/>
-        </w:rPr>
-        <w:t xml:space="preserve">Accumulate liquid waste at the point of generation - the designated gel bench - in a sturdy, chemically compatible, opaque or foil-wrapped HDPE container with a securely closable screw-top lid, kept closed except when actively adding waste, and in secondary containment.</w:t>
-      </w:r>
-    </w:p>
-    <w:p>
-      <w:pPr>
-        <w:pStyle w:val="ListParagraph"/>
-        <w:numPr>
-          <w:ilvl w:val="0"/>
-          <w:numId w:val="2"/>
-        </w:numPr>
-        <w:spacing w:after="100" w:line="260"/>
-      </w:pPr>
-      <w:r>
-        <w:rPr>
-          <w:rFonts w:ascii="Calibri" w:cs="Calibri" w:eastAsia="Calibri" w:hAnsi="Calibri"/>
-          <w:sz w:val="20"/>
-          <w:szCs w:val="20"/>
-        </w:rPr>
-        <w:t xml:space="preserve">Solid waste (gels, gloves, tips, wipes) is accumulated in a dedicated, lined, closed container at the designated bench, labeled 'ETHIDIUM BROMIDE SOLID WASTE - MUTAGEN'.</w:t>
+        <w:t>Waste streams: (a) unused ethidium bromide powder; (b) 10 mg/mL stock solution; (c) stained agarose gels; (d) contaminated solid debris (gloves, tips, wipes, absorbent liners, weigh boats). The electrophoresis running buffer is not stained under this SOP and is not a routine EtBr waste stream - see the note below.</w:t>
+      </w:r>
+    </w:p>
+    <w:p>
+      <w:pPr>
+        <w:pStyle w:val="ListParagraph"/>
+        <w:numPr>
+          <w:ilvl w:val="0"/>
+          <w:numId w:val="2"/>
+        </w:numPr>
+        <w:spacing w:after="100" w:line="260"/>
+      </w:pPr>
+      <w:r>
+        <w:rPr>
+          <w:rFonts w:ascii="Calibri" w:cs="Calibri" w:eastAsia="Calibri" w:hAnsi="Calibri"/>
+          <w:sz w:val="20"/>
+          <w:szCs w:val="20"/>
+        </w:rPr>
+        <w:t>Ethidium bromide is added only to the molten agarose under this SOP; the electrophoresis running buffer in the tank is not intentionally stained and is disposed of or reused as ordinary 1X TAE/TBE buffer, not as EtBr-contaminated waste. Stained agarose gels at the 0.1 microgram/mL working concentration used here are approximately 0.00001% (1x10^-5 %) w/v ethidium bromide - far below the 0.1% w/v threshold below which UW EH&amp;S (https://www.ehs.washington.edu/chemical/chemical-treatment-and-recycling) treats stained gels as non-hazardous, so gels are trash-eligible as described below. If running buffer or rinse water is ever visibly pink or red (indicating gel dye has bled into it, or a spill), treat it as EtBr-contaminated liquid: solutions confirmed below 10 micrograms per liter (10 ppb) may be disposed of down the drain; anything at or above that threshold, or not confirmed, requires the carbon-adsorption treatment in the next paragraph before drain disposal, or collection as hazardous waste. The unused powder and the 10 mg/mL stock solution remain hazardous waste at all times and must never be poured down the drain.</w:t>
+      </w:r>
+    </w:p>
+    <w:p>
+      <w:pPr>
+        <w:pStyle w:val="ListParagraph"/>
+        <w:numPr>
+          <w:ilvl w:val="0"/>
+          <w:numId w:val="2"/>
+        </w:numPr>
+        <w:spacing w:after="100" w:line="260"/>
+      </w:pPr>
+      <w:r>
+        <w:rPr>
+          <w:rFonts w:ascii="Calibri" w:cs="Calibri" w:eastAsia="Calibri" w:hAnsi="Calibri"/>
+          <w:sz w:val="20"/>
+          <w:szCs w:val="20"/>
+        </w:rPr>
+        <w:t>Do NOT bleach or photodegrade ethidium bromide waste in the lab. Hypochlorite treatment produces mutagenic degradation products. The only in-lab treatment authorized under this SOP is activated-carbon adsorption of EtBr-contaminated liquid (expected only if running buffer or rinse water becomes visibly discolored), as described below.</w:t>
+      </w:r>
+    </w:p>
+    <w:p>
+      <w:pPr>
+        <w:pStyle w:val="ListParagraph"/>
+      </w:pPr>
+      <w:r>
+        <w:t>Treatment of EtBr-contaminated liquid (a visibly discolored running buffer, or gel-soak/rinse water from equipment decontamination): use activated-carbon adsorption bags (e.g., GreenBags or an equivalent EH&amp;S-recommended product) per the manufacturer's instructions. Once the ethidium bromide has been adsorbed, the treated water may be disposed of down the drain with running water. The spent carbon bags adsorb ethidium bromide tightly enough to be discarded as regular solid waste; double-bag, label "non-hazardous - treated EtBr adsorbent," and discard in the regular trash.</w:t>
+      </w:r>
+    </w:p>
+    <w:p>
+      <w:pPr>
+        <w:pStyle w:val="ListParagraph"/>
+        <w:numPr>
+          <w:ilvl w:val="0"/>
+          <w:numId w:val="2"/>
+        </w:numPr>
+        <w:spacing w:after="100" w:line="260"/>
+      </w:pPr>
+      <w:r>
+        <w:rPr>
+          <w:rFonts w:ascii="Calibri" w:cs="Calibri" w:eastAsia="Calibri" w:hAnsi="Calibri"/>
+          <w:sz w:val="20"/>
+          <w:szCs w:val="20"/>
+        </w:rPr>
+        <w:t>Stained agarose gels containing less than 0.1% ethidium bromide (all gels cast at the working concentration used in this SOP - see Section 6 above) may be double-bagged, labeled "non-hazardous," and discarded in the regular trash. A gel that appears pink or red, indicating a substantially higher concentration, is not covered by this exception and must be managed as hazardous waste. Pipette tips that contacted dilute ethidium bromide are air-dried and then placed in the laboratory broken-glass/sharps container, not the liquid or general solid waste stream.</w:t>
+      </w:r>
+    </w:p>
+    <w:p>
+      <w:pPr>
+        <w:pStyle w:val="ListParagraph"/>
+        <w:numPr>
+          <w:ilvl w:val="0"/>
+          <w:numId w:val="2"/>
+        </w:numPr>
+        <w:spacing w:after="100" w:line="260"/>
+      </w:pPr>
+      <w:r>
+        <w:rPr>
+          <w:rFonts w:ascii="Calibri" w:cs="Calibri" w:eastAsia="Calibri" w:hAnsi="Calibri"/>
+          <w:sz w:val="20"/>
+          <w:szCs w:val="20"/>
+        </w:rPr>
+        <w:t>Accumulate any EtBr-contaminated liquid that does not qualify for drain disposal (the 10 mg/mL stock, and any visibly discolored running buffer or rinse water prior to carbon treatment) at the point of generation - the designated gel bench - in a sturdy, chemically compatible, opaque or foil-wrapped HDPE container with a securely closable screw-top lid, kept closed except when actively adding waste, and in secondary containment.</w:t>
+      </w:r>
+    </w:p>
+    <w:p>
+      <w:pPr>
+        <w:pStyle w:val="ListParagraph"/>
+        <w:numPr>
+          <w:ilvl w:val="0"/>
+          <w:numId w:val="2"/>
+        </w:numPr>
+        <w:spacing w:after="100" w:line="260"/>
+      </w:pPr>
+      <w:r>
+        <w:rPr>
+          <w:rFonts w:ascii="Calibri" w:cs="Calibri" w:eastAsia="Calibri" w:hAnsi="Calibri"/>
+          <w:sz w:val="20"/>
+          <w:szCs w:val="20"/>
+        </w:rPr>
+        <w:t>Solid debris that does not qualify for the trash exceptions above - gloves, wipes and weigh boats from powder or 10 mg/mL stock handling, pink/red gels, and any absorbent used for a spill or for treated-liquid handling before it is confirmed non-hazardous - is accumulated in a dedicated, lined, closed container at the designated bench, labeled 'ETHIDIUM BROMIDE SOLID WASTE - MUTAGEN'.</w:t>
       </w:r>
     </w:p>
     <w:p>
@@ -2584,7 +2592,7 @@
           <w:sz w:val="20"/>
           <w:szCs w:val="20"/>
         </w:rPr>
-        <w:t xml:space="preserve">Procedure B - Casting stained agarose gels. At the designated gel bench, on an absorbent liner: melt agarose in TAE or TBE, cool to approximately 55-60 degC, add 10 mg/mL stock to 0.5 microgram/mL final using a dedicated pipette, swirl gently (do not create aerosol), and pour into the gel tray. Discard the tip into the dedicated solid waste container.</w:t>
+        <w:t>Procedure B - Casting stained agarose gels. At the designated gel bench, on an absorbent liner: melt agarose in TAE or TBE, cool to approximately 55-60 degC, add 1 uL of 10 mg/mL stock per 100 mL of buffer (0.1 microgram/mL final) using a dedicated pipette, swirl gently (do not create aerosol), and pour into the gel tray. Discard the tip into the dedicated solid waste container.</w:t>
       </w:r>
     </w:p>
     <w:p>
@@ -2620,25 +2628,25 @@
           <w:sz w:val="20"/>
           <w:szCs w:val="20"/>
         </w:rPr>
-        <w:t xml:space="preserve">Procedure D - Buffer and equipment handling. Collect used running buffer into the labeled liquid waste container. Rinse the gel box and tray with a small volume of water into the liquid waste container, then wash with detergent and water at the designated bench, and survey with a UV lamp before returning them to the 'EtBr ONLY' storage location.</w:t>
-      </w:r>
-    </w:p>
-    <w:p>
-      <w:pPr>
-        <w:pStyle w:val="ListParagraph"/>
-        <w:numPr>
-          <w:ilvl w:val="0"/>
-          <w:numId w:val="2"/>
-        </w:numPr>
-        <w:spacing w:after="100" w:line="260"/>
-      </w:pPr>
-      <w:r>
-        <w:rPr>
-          <w:rFonts w:ascii="Calibri" w:cs="Calibri" w:eastAsia="Calibri" w:hAnsi="Calibri"/>
-          <w:sz w:val="20"/>
-          <w:szCs w:val="20"/>
-        </w:rPr>
-        <w:t xml:space="preserve">Prohibited: weighing powder outside the fume hood; bleach treatment of any ethidium bromide material; drain disposal; use of latex gloves; carrying gel-area gloves outside the designated area; use by untrained or unauthorized personnel.</w:t>
+        <w:t>Procedure D - Buffer and equipment handling. The electrophoresis running buffer is not stained under this SOP and may be reused for subsequent runs or disposed of as ordinary 1X TAE/TBE buffer (drain disposal, no special labeling), unless it appears visibly pink or red, in which case treat it as EtBr-contaminated liquid per Section 6. Rinse the gel box and tray with a small volume of water at the designated bench - this rinse water follows the same rule as the running buffer. Wash with detergent and water, and survey with a UV lamp before returning equipment to the 'EtBr ONLY' storage location.</w:t>
+      </w:r>
+    </w:p>
+    <w:p>
+      <w:pPr>
+        <w:pStyle w:val="ListParagraph"/>
+        <w:numPr>
+          <w:ilvl w:val="0"/>
+          <w:numId w:val="2"/>
+        </w:numPr>
+        <w:spacing w:after="100" w:line="260"/>
+      </w:pPr>
+      <w:r>
+        <w:rPr>
+          <w:rFonts w:ascii="Calibri" w:cs="Calibri" w:eastAsia="Calibri" w:hAnsi="Calibri"/>
+          <w:sz w:val="20"/>
+          <w:szCs w:val="20"/>
+        </w:rPr>
+        <w:t>Prohibited: weighing powder outside the fume hood; bleach treatment of any ethidium bromide material; drain disposal of the powder, the 10 mg/mL stock, or any visibly EtBr-contaminated liquid that has not been carbon-treated (or confirmed below 10 micrograms per liter); use of latex gloves; carrying gel-area gloves outside the designated area; use by untrained or unauthorized personnel.</w:t>
       </w:r>
     </w:p>
     <w:p>

</xml_diff>